<commit_message>
docs: Expand Synopsis to 12 pages with placeholders
</commit_message>
<xml_diff>
--- a/Synopsis.docx
+++ b/Synopsis.docx
@@ -2,8 +2,6 @@
 <file path=word/document.xml><?xml version="1.0" encoding="utf-8"?>
 <w:document xmlns:wpc="http://schemas.microsoft.com/office/word/2010/wordprocessingCanvas" xmlns:mo="http://schemas.microsoft.com/office/mac/office/2008/main" xmlns:mc="http://schemas.openxmlformats.org/markup-compatibility/2006" xmlns:mv="urn:schemas-microsoft-com:mac:vml" xmlns:o="urn:schemas-microsoft-com:office:office" xmlns:r="http://schemas.openxmlformats.org/officeDocument/2006/relationships" xmlns:m="http://schemas.openxmlformats.org/officeDocument/2006/math" xmlns:v="urn:schemas-microsoft-com:vml" xmlns:wp14="http://schemas.microsoft.com/office/word/2010/wordprocessingDrawing" xmlns:wp="http://schemas.openxmlformats.org/drawingml/2006/wordprocessingDrawing" xmlns:w10="urn:schemas-microsoft-com:office:word" xmlns:w="http://schemas.openxmlformats.org/wordprocessingml/2006/main" xmlns:w14="http://schemas.microsoft.com/office/word/2010/wordml" xmlns:wpg="http://schemas.microsoft.com/office/word/2010/wordprocessingGroup" xmlns:wpi="http://schemas.microsoft.com/office/word/2010/wordprocessingInk" xmlns:wne="http://schemas.microsoft.com/office/word/2006/wordml" xmlns:wps="http://schemas.microsoft.com/office/word/2010/wordprocessingShape" mc:Ignorable="w14 wp14">
   <w:body>
-    <w:p/>
-    <w:p/>
     <w:p/>
     <w:p/>
     <w:p/>
@@ -18,9 +16,11 @@
         <w:rPr>
           <w:rFonts w:ascii="Times New Roman" w:hAnsi="Times New Roman"/>
           <w:b/>
-          <w:sz w:val="40"/>
+          <w:sz w:val="32"/>
         </w:rPr>
         <w:t>PROJECT SYNOPSIS</w:t>
+        <w:br/>
+        <w:t>ON</w:t>
       </w:r>
     </w:p>
     <w:p>
@@ -31,7 +31,7 @@
         <w:rPr>
           <w:rFonts w:ascii="Times New Roman" w:hAnsi="Times New Roman"/>
           <w:b/>
-          <w:sz w:val="36"/>
+          <w:sz w:val="40"/>
         </w:rPr>
         <w:t>SafeRoute AI: Crowdsourced Women's Safety &amp; Navigation System</w:t>
       </w:r>
@@ -40,6 +40,22 @@
     <w:p/>
     <w:p/>
     <w:p/>
+    <w:p/>
+    <w:p>
+      <w:pPr>
+        <w:jc w:val="center"/>
+      </w:pPr>
+      <w:r>
+        <w:rPr>
+          <w:rFonts w:ascii="Times New Roman" w:hAnsi="Times New Roman"/>
+          <w:b/>
+          <w:sz w:val="24"/>
+        </w:rPr>
+        <w:t>Submitted in partial fulfillment for the award of degree of</w:t>
+        <w:br/>
+        <w:t>[COURSE / DEGREE NAME]</w:t>
+      </w:r>
+    </w:p>
     <w:p/>
     <w:p/>
     <w:p/>
@@ -58,10 +74,9 @@
         <w:br/>
         <w:t>Anveshi Sahu</w:t>
         <w:br/>
-        <w:t>[Your Roll Number / ID]</w:t>
+        <w:t>[ROLL NUMBER]</w:t>
       </w:r>
     </w:p>
-    <w:p/>
     <w:p/>
     <w:p/>
     <w:p/>
@@ -77,12 +92,11 @@
         </w:rPr>
         <w:t>Under the Guidance of:</w:t>
         <w:br/>
-        <w:t>[Guide Name]</w:t>
+        <w:t>[GUIDE'S NAME]</w:t>
         <w:br/>
-        <w:t>[Designation]</w:t>
+        <w:t>[GUIDE'S DESIGNATION]</w:t>
       </w:r>
     </w:p>
-    <w:p/>
     <w:p/>
     <w:p/>
     <w:p/>
@@ -96,7 +110,9 @@
           <w:b/>
           <w:sz w:val="28"/>
         </w:rPr>
-        <w:t>[Institution / College Name]</w:t>
+        <w:t>[COLLEGE / UNIVERSITY NAME]</w:t>
+        <w:br/>
+        <w:t>[CITY, STATE]</w:t>
         <w:br/>
         <w:t>2024 - 2025</w:t>
       </w:r>
@@ -108,8 +124,8 @@
     </w:p>
     <w:p>
       <w:pPr>
-        <w:spacing w:after="120" w:line="360" w:lineRule="auto"/>
-        <w:jc w:val="left"/>
+        <w:spacing w:before="480" w:after="240" w:line="360" w:lineRule="auto"/>
+        <w:jc w:val="center"/>
       </w:pPr>
       <w:r>
         <w:rPr>
@@ -117,7 +133,7 @@
           <w:b/>
           <w:sz w:val="32"/>
         </w:rPr>
-        <w:t>1. Introduction</w:t>
+        <w:t>DECLARATION</w:t>
       </w:r>
     </w:p>
     <w:p>
@@ -131,7 +147,7 @@
           <w:b w:val="0"/>
           <w:sz w:val="24"/>
         </w:rPr>
-        <w:t>In modern urban environments, ensuring the safety of women during daily commutes remains a pressing challenge. Conventional navigation systems (like Google Maps or Apple Maps) prioritize the shortest or fastest routes, failing to account for environmental safety factors such as street lighting, crowd density, and historical incident data.</w:t>
+        <w:t>I hereby declare that the project entitled "SafeRoute AI: Crowdsourced Women's Safety &amp; Navigation System" submitted in partial fulfillment of the requirements for the award of the degree of [COURSE / DEGREE NAME] is an authentic record of my own work carried out under the guidance of [GUIDE'S NAME].</w:t>
       </w:r>
     </w:p>
     <w:p>
@@ -145,13 +161,32 @@
           <w:b w:val="0"/>
           <w:sz w:val="24"/>
         </w:rPr>
-        <w:t>SafeRoute AI is a dynamic navigation platform designed to bridge this gap. By leveraging open-source routing algorithms, real-time geocoding, and crowdsourced community intelligence, the system provides users with the safest possible routes rather than simply the fastest. The integration of continuous user feedback ensures that the system dynamically adapts to changing urban landscapes, providing highly accurate safety predictions.</w:t>
+        <w:t>The matter embodied in this synopsis has not been submitted by me for the award of any other degree or diploma.</w:t>
+      </w:r>
+    </w:p>
+    <w:p/>
+    <w:p/>
+    <w:p/>
+    <w:p>
+      <w:pPr>
+        <w:spacing w:after="120" w:line="360" w:lineRule="auto"/>
+        <w:jc w:val="right"/>
+      </w:pPr>
+      <w:r>
+        <w:rPr>
+          <w:rFonts w:ascii="Times New Roman" w:hAnsi="Times New Roman"/>
+          <w:b/>
+          <w:sz w:val="24"/>
+        </w:rPr>
+        <w:t>Anveshi Sahu</w:t>
+        <w:br/>
+        <w:t>[ROLL NUMBER]</w:t>
       </w:r>
     </w:p>
     <w:p>
       <w:pPr>
-        <w:spacing w:after="120" w:line="360" w:lineRule="auto"/>
-        <w:jc w:val="left"/>
+        <w:spacing w:before="480" w:after="240" w:line="360" w:lineRule="auto"/>
+        <w:jc w:val="center"/>
       </w:pPr>
       <w:r>
         <w:rPr>
@@ -159,7 +194,7 @@
           <w:b/>
           <w:sz w:val="32"/>
         </w:rPr>
-        <w:t>2. Problem Statement</w:t>
+        <w:t>ACKNOWLEDGMENT</w:t>
       </w:r>
     </w:p>
     <w:p>
@@ -173,13 +208,32 @@
           <w:b w:val="0"/>
           <w:sz w:val="24"/>
         </w:rPr>
-        <w:t>Current mapping solutions optimize for time and distance, often routing pedestrians or solo female travelers through isolated, poorly lit, or historically unsafe areas, particularly at night. There is a critical lack of a dedicated navigation framework that assesses routes based on empirical and crowdsourced safety metrics.</w:t>
+        <w:t>I would like to express my profound gratitude to my guide, [GUIDE'S NAME], [GUIDE'S DESIGNATION], for their invaluable guidance, encouragement, and support throughout the development of this project.</w:t>
       </w:r>
     </w:p>
     <w:p>
       <w:pPr>
         <w:spacing w:after="120" w:line="360" w:lineRule="auto"/>
-        <w:jc w:val="left"/>
+        <w:jc w:val="both"/>
+      </w:pPr>
+      <w:r>
+        <w:rPr>
+          <w:rFonts w:ascii="Times New Roman" w:hAnsi="Times New Roman"/>
+          <w:b w:val="0"/>
+          <w:sz w:val="24"/>
+        </w:rPr>
+        <w:t>I am also deeply thankful to the Head of the Department, [HOD'S NAME], and the faculty members for providing the necessary facilities and a conducive environment for research and development. Finally, I would like to thank my family and peers for their continuous moral support.</w:t>
+      </w:r>
+    </w:p>
+    <w:p>
+      <w:r>
+        <w:br w:type="page"/>
+      </w:r>
+    </w:p>
+    <w:p>
+      <w:pPr>
+        <w:spacing w:before="480" w:after="240" w:line="360" w:lineRule="auto"/>
+        <w:jc w:val="center"/>
       </w:pPr>
       <w:r>
         <w:rPr>
@@ -187,7 +241,372 @@
           <w:b/>
           <w:sz w:val="32"/>
         </w:rPr>
-        <w:t>3. Objectives</w:t>
+        <w:t>ABSTRACT</w:t>
+      </w:r>
+    </w:p>
+    <w:p>
+      <w:pPr>
+        <w:spacing w:after="120" w:line="360" w:lineRule="auto"/>
+        <w:jc w:val="both"/>
+      </w:pPr>
+      <w:r>
+        <w:rPr>
+          <w:rFonts w:ascii="Times New Roman" w:hAnsi="Times New Roman"/>
+          <w:b w:val="0"/>
+          <w:sz w:val="24"/>
+        </w:rPr>
+        <w:t>In recent years, urban mobility has expanded exponentially, yet the personal safety of vulnerable demographics, particularly women, remains a significant concern. Conventional navigation applications prioritize distance and time optimization, ignoring critical environmental safety parameters such as street lighting, crowd density, and crime history. This project introduces SafeRoute AI, an intelligent, crowdsourced navigation platform designed to bridge this gap.</w:t>
+      </w:r>
+    </w:p>
+    <w:p>
+      <w:pPr>
+        <w:spacing w:after="120" w:line="360" w:lineRule="auto"/>
+        <w:jc w:val="both"/>
+      </w:pPr>
+      <w:r>
+        <w:rPr>
+          <w:rFonts w:ascii="Times New Roman" w:hAnsi="Times New Roman"/>
+          <w:b w:val="0"/>
+          <w:sz w:val="24"/>
+        </w:rPr>
+        <w:t>SafeRoute AI dynamically calculates pedestrian and driving routes by integrating real-time routing engines (OSRM) with spatial geocoding (Nominatim). Unlike traditional maps, SafeRoute AI introduces a 'Safety Heatmap' layer, clustering historical and crowdsourced incident data to identify high-risk zones. The platform features an active feedback loop, allowing users to rate routes based on actual on-ground conditions upon journey completion. These data points continuously update the backend database, enabling the system to evolve and adapt to changing urban environments.</w:t>
+      </w:r>
+    </w:p>
+    <w:p>
+      <w:pPr>
+        <w:spacing w:after="120" w:line="360" w:lineRule="auto"/>
+        <w:jc w:val="both"/>
+      </w:pPr>
+      <w:r>
+        <w:rPr>
+          <w:rFonts w:ascii="Times New Roman" w:hAnsi="Times New Roman"/>
+          <w:b w:val="0"/>
+          <w:sz w:val="24"/>
+        </w:rPr>
+        <w:t>Built using a decoupled client-server architecture with HTML5, Leaflet.js, and a robust Supabase (PostgreSQL) backend, the system demonstrates how technology can be leveraged to prioritize human safety over mere travel efficiency. The resulting application offers an intuitive, scalable, and responsive solution to modern urban safety challenges.</w:t>
+      </w:r>
+    </w:p>
+    <w:p>
+      <w:r>
+        <w:br w:type="page"/>
+      </w:r>
+    </w:p>
+    <w:p>
+      <w:pPr>
+        <w:spacing w:before="480" w:after="240" w:line="360" w:lineRule="auto"/>
+        <w:jc w:val="center"/>
+      </w:pPr>
+      <w:r>
+        <w:rPr>
+          <w:rFonts w:ascii="Times New Roman" w:hAnsi="Times New Roman"/>
+          <w:b/>
+          <w:sz w:val="32"/>
+        </w:rPr>
+        <w:t>TABLE OF CONTENTS</w:t>
+      </w:r>
+    </w:p>
+    <w:p>
+      <w:pPr>
+        <w:spacing w:after="120" w:line="360" w:lineRule="auto"/>
+        <w:jc w:val="both"/>
+      </w:pPr>
+      <w:r>
+        <w:rPr>
+          <w:rFonts w:ascii="Times New Roman" w:hAnsi="Times New Roman"/>
+          <w:b/>
+          <w:sz w:val="24"/>
+        </w:rPr>
+        <w:t>1. Introduction</w:t>
+      </w:r>
+    </w:p>
+    <w:p>
+      <w:pPr>
+        <w:spacing w:after="120" w:line="360" w:lineRule="auto"/>
+        <w:jc w:val="both"/>
+      </w:pPr>
+      <w:r>
+        <w:rPr>
+          <w:rFonts w:ascii="Times New Roman" w:hAnsi="Times New Roman"/>
+          <w:b/>
+          <w:sz w:val="24"/>
+        </w:rPr>
+        <w:t>2. Problem Statement</w:t>
+      </w:r>
+    </w:p>
+    <w:p>
+      <w:pPr>
+        <w:spacing w:after="120" w:line="360" w:lineRule="auto"/>
+        <w:jc w:val="both"/>
+      </w:pPr>
+      <w:r>
+        <w:rPr>
+          <w:rFonts w:ascii="Times New Roman" w:hAnsi="Times New Roman"/>
+          <w:b/>
+          <w:sz w:val="24"/>
+        </w:rPr>
+        <w:t>3. Objectives &amp; Scope</w:t>
+      </w:r>
+    </w:p>
+    <w:p>
+      <w:pPr>
+        <w:spacing w:after="120" w:line="360" w:lineRule="auto"/>
+        <w:jc w:val="both"/>
+      </w:pPr>
+      <w:r>
+        <w:rPr>
+          <w:rFonts w:ascii="Times New Roman" w:hAnsi="Times New Roman"/>
+          <w:b/>
+          <w:sz w:val="24"/>
+        </w:rPr>
+        <w:t>4. Literature Survey</w:t>
+      </w:r>
+    </w:p>
+    <w:p>
+      <w:pPr>
+        <w:spacing w:after="120" w:line="360" w:lineRule="auto"/>
+        <w:jc w:val="both"/>
+      </w:pPr>
+      <w:r>
+        <w:rPr>
+          <w:rFonts w:ascii="Times New Roman" w:hAnsi="Times New Roman"/>
+          <w:b/>
+          <w:sz w:val="24"/>
+        </w:rPr>
+        <w:t>5. System Analysis &amp; Feasibility Study</w:t>
+      </w:r>
+    </w:p>
+    <w:p>
+      <w:pPr>
+        <w:spacing w:after="120" w:line="360" w:lineRule="auto"/>
+        <w:jc w:val="both"/>
+      </w:pPr>
+      <w:r>
+        <w:rPr>
+          <w:rFonts w:ascii="Times New Roman" w:hAnsi="Times New Roman"/>
+          <w:b/>
+          <w:sz w:val="24"/>
+        </w:rPr>
+        <w:t>6. System Design (DFD, ER, Use Case)</w:t>
+      </w:r>
+    </w:p>
+    <w:p>
+      <w:pPr>
+        <w:spacing w:after="120" w:line="360" w:lineRule="auto"/>
+        <w:jc w:val="both"/>
+      </w:pPr>
+      <w:r>
+        <w:rPr>
+          <w:rFonts w:ascii="Times New Roman" w:hAnsi="Times New Roman"/>
+          <w:b/>
+          <w:sz w:val="24"/>
+        </w:rPr>
+        <w:t>7. Database Schema</w:t>
+      </w:r>
+    </w:p>
+    <w:p>
+      <w:pPr>
+        <w:spacing w:after="120" w:line="360" w:lineRule="auto"/>
+        <w:jc w:val="both"/>
+      </w:pPr>
+      <w:r>
+        <w:rPr>
+          <w:rFonts w:ascii="Times New Roman" w:hAnsi="Times New Roman"/>
+          <w:b/>
+          <w:sz w:val="24"/>
+        </w:rPr>
+        <w:t>8. Implementation Methodology</w:t>
+      </w:r>
+    </w:p>
+    <w:p>
+      <w:pPr>
+        <w:spacing w:after="120" w:line="360" w:lineRule="auto"/>
+        <w:jc w:val="both"/>
+      </w:pPr>
+      <w:r>
+        <w:rPr>
+          <w:rFonts w:ascii="Times New Roman" w:hAnsi="Times New Roman"/>
+          <w:b/>
+          <w:sz w:val="24"/>
+        </w:rPr>
+        <w:t>9. Future Scope &amp; Conclusion</w:t>
+      </w:r>
+    </w:p>
+    <w:p>
+      <w:pPr>
+        <w:spacing w:after="120" w:line="360" w:lineRule="auto"/>
+        <w:jc w:val="both"/>
+      </w:pPr>
+      <w:r>
+        <w:rPr>
+          <w:rFonts w:ascii="Times New Roman" w:hAnsi="Times New Roman"/>
+          <w:b/>
+          <w:sz w:val="24"/>
+        </w:rPr>
+        <w:t>10. References</w:t>
+      </w:r>
+    </w:p>
+    <w:p>
+      <w:r>
+        <w:br w:type="page"/>
+      </w:r>
+    </w:p>
+    <w:p>
+      <w:pPr>
+        <w:spacing w:before="480" w:after="240" w:line="360" w:lineRule="auto"/>
+        <w:jc w:val="center"/>
+      </w:pPr>
+      <w:r>
+        <w:rPr>
+          <w:rFonts w:ascii="Times New Roman" w:hAnsi="Times New Roman"/>
+          <w:b/>
+          <w:sz w:val="32"/>
+        </w:rPr>
+        <w:t>1. INTRODUCTION</w:t>
+      </w:r>
+    </w:p>
+    <w:p>
+      <w:pPr>
+        <w:spacing w:before="240" w:after="240" w:line="360" w:lineRule="auto"/>
+        <w:jc w:val="left"/>
+      </w:pPr>
+      <w:r>
+        <w:rPr>
+          <w:rFonts w:ascii="Times New Roman" w:hAnsi="Times New Roman"/>
+          <w:b/>
+          <w:sz w:val="28"/>
+        </w:rPr>
+        <w:t>1.1 Background</w:t>
+      </w:r>
+    </w:p>
+    <w:p>
+      <w:pPr>
+        <w:spacing w:after="120" w:line="360" w:lineRule="auto"/>
+        <w:jc w:val="both"/>
+      </w:pPr>
+      <w:r>
+        <w:rPr>
+          <w:rFonts w:ascii="Times New Roman" w:hAnsi="Times New Roman"/>
+          <w:b w:val="0"/>
+          <w:sz w:val="24"/>
+        </w:rPr>
+        <w:t>Urbanization has dramatically increased the need for independent mobility. However, safety concerns often restrict the movement of women, especially during late hours. Navigation systems are a ubiquitous part of daily life, yet they lack contextual awareness regarding the safety of the routes they suggest.</w:t>
+      </w:r>
+    </w:p>
+    <w:p>
+      <w:pPr>
+        <w:spacing w:before="240" w:after="240" w:line="360" w:lineRule="auto"/>
+        <w:jc w:val="left"/>
+      </w:pPr>
+      <w:r>
+        <w:rPr>
+          <w:rFonts w:ascii="Times New Roman" w:hAnsi="Times New Roman"/>
+          <w:b/>
+          <w:sz w:val="28"/>
+        </w:rPr>
+        <w:t>1.2 Motivation</w:t>
+      </w:r>
+    </w:p>
+    <w:p>
+      <w:pPr>
+        <w:spacing w:after="120" w:line="360" w:lineRule="auto"/>
+        <w:jc w:val="both"/>
+      </w:pPr>
+      <w:r>
+        <w:rPr>
+          <w:rFonts w:ascii="Times New Roman" w:hAnsi="Times New Roman"/>
+          <w:b w:val="0"/>
+          <w:sz w:val="24"/>
+        </w:rPr>
+        <w:t>The motivation behind SafeRoute AI stems from the alarming statistics of urban street harassment and crime against women. Technology should act as an enabler of safety, not just efficiency. By leveraging the power of crowdsourcing and open-source mapping tools, we can create a platform that actively steers users away from dangerous areas.</w:t>
+      </w:r>
+    </w:p>
+    <w:p>
+      <w:pPr>
+        <w:spacing w:before="240" w:after="240" w:line="360" w:lineRule="auto"/>
+        <w:jc w:val="left"/>
+      </w:pPr>
+      <w:r>
+        <w:rPr>
+          <w:rFonts w:ascii="Times New Roman" w:hAnsi="Times New Roman"/>
+          <w:b/>
+          <w:sz w:val="28"/>
+        </w:rPr>
+        <w:t>1.3 Scope of the Project</w:t>
+      </w:r>
+    </w:p>
+    <w:p>
+      <w:pPr>
+        <w:spacing w:after="120" w:line="360" w:lineRule="auto"/>
+        <w:jc w:val="both"/>
+      </w:pPr>
+      <w:r>
+        <w:rPr>
+          <w:rFonts w:ascii="Times New Roman" w:hAnsi="Times New Roman"/>
+          <w:b w:val="0"/>
+          <w:sz w:val="24"/>
+        </w:rPr>
+        <w:t>The current scope encompasses a web-based prototype utilizing open-source APIs to map routes and gather user feedback. The system focuses on visualizing safety via heatmaps and generating dynamic safety scores for selected routes.</w:t>
+      </w:r>
+    </w:p>
+    <w:p>
+      <w:r>
+        <w:br w:type="page"/>
+      </w:r>
+    </w:p>
+    <w:p>
+      <w:pPr>
+        <w:spacing w:before="480" w:after="240" w:line="360" w:lineRule="auto"/>
+        <w:jc w:val="center"/>
+      </w:pPr>
+      <w:r>
+        <w:rPr>
+          <w:rFonts w:ascii="Times New Roman" w:hAnsi="Times New Roman"/>
+          <w:b/>
+          <w:sz w:val="32"/>
+        </w:rPr>
+        <w:t>2. PROBLEM STATEMENT</w:t>
+      </w:r>
+    </w:p>
+    <w:p>
+      <w:pPr>
+        <w:spacing w:after="120" w:line="360" w:lineRule="auto"/>
+        <w:jc w:val="both"/>
+      </w:pPr>
+      <w:r>
+        <w:rPr>
+          <w:rFonts w:ascii="Times New Roman" w:hAnsi="Times New Roman"/>
+          <w:b w:val="0"/>
+          <w:sz w:val="24"/>
+        </w:rPr>
+        <w:t>Current commercial mapping solutions, such as Google Maps and Apple Maps, utilize algorithms strictly optimized for time and distance (e.g., Dijkstra’s or A* algorithms based on traffic). They inherently direct pedestrians or solo travelers through isolated, poorly lit, or historically unsafe areas if it saves a few minutes. There is a critical lack of a dedicated navigation framework that assesses routes based on empirical, crowdsourced safety metrics.</w:t>
+      </w:r>
+    </w:p>
+    <w:p>
+      <w:pPr>
+        <w:spacing w:before="480" w:after="240" w:line="360" w:lineRule="auto"/>
+        <w:jc w:val="center"/>
+      </w:pPr>
+      <w:r>
+        <w:rPr>
+          <w:rFonts w:ascii="Times New Roman" w:hAnsi="Times New Roman"/>
+          <w:b/>
+          <w:sz w:val="32"/>
+        </w:rPr>
+        <w:t>3. OBJECTIVES</w:t>
+      </w:r>
+    </w:p>
+    <w:p>
+      <w:pPr>
+        <w:spacing w:after="120" w:line="360" w:lineRule="auto"/>
+        <w:jc w:val="both"/>
+      </w:pPr>
+      <w:r>
+        <w:rPr>
+          <w:rFonts w:ascii="Times New Roman" w:hAnsi="Times New Roman"/>
+          <w:b w:val="0"/>
+          <w:sz w:val="24"/>
+        </w:rPr>
+        <w:t>The primary objectives of this project include:</w:t>
       </w:r>
     </w:p>
     <w:p>
@@ -202,7 +621,7 @@
           <w:b w:val="0"/>
           <w:sz w:val="24"/>
         </w:rPr>
-        <w:t>- To develop a responsive, web-based platform that calculates navigation routes prioritizing user safety.</w:t>
+        <w:t>- To develop a responsive web application that calculates navigation routes prioritizing user safety over speed.</w:t>
       </w:r>
     </w:p>
     <w:p>
@@ -217,7 +636,7 @@
           <w:b w:val="0"/>
           <w:sz w:val="24"/>
         </w:rPr>
-        <w:t>- To implement a dynamic "Safety Heatmap" visualizing high-risk vs. safe zones using clustered spatial data.</w:t>
+        <w:t>- To implement a dynamic 'Safety Heatmap' visualizing high-risk vs. safe zones using spatial clustering.</w:t>
       </w:r>
     </w:p>
     <w:p>
@@ -232,7 +651,7 @@
           <w:b w:val="0"/>
           <w:sz w:val="24"/>
         </w:rPr>
-        <w:t>- To generate predictive safety scores for any given route using real-time parameter analysis.</w:t>
+        <w:t>- To generate predictive safety scores for queried routes using parameter analysis.</w:t>
       </w:r>
     </w:p>
     <w:p>
@@ -247,21 +666,7 @@
           <w:b w:val="0"/>
           <w:sz w:val="24"/>
         </w:rPr>
-        <w:t>- To establish a continuous "Community Feedback Loop" allowing users to anonymously rate route conditions.</w:t>
-      </w:r>
-    </w:p>
-    <w:p>
-      <w:pPr>
-        <w:spacing w:after="120" w:line="360" w:lineRule="auto"/>
-        <w:jc w:val="left"/>
-      </w:pPr>
-      <w:r>
-        <w:rPr>
-          <w:rFonts w:ascii="Times New Roman" w:hAnsi="Times New Roman"/>
-          <w:b/>
-          <w:sz w:val="32"/>
-        </w:rPr>
-        <w:t>4. Tech Stack &amp; Software Specifications</w:t>
+        <w:t>- To establish a continuous 'Community Feedback Loop' allowing users to rate route conditions anonymously.</w:t>
       </w:r>
     </w:p>
     <w:p>
@@ -276,88 +681,18 @@
           <w:b w:val="0"/>
           <w:sz w:val="24"/>
         </w:rPr>
-        <w:t>- Frontend Environment: HTML5, CSS3, Vanilla JavaScript.</w:t>
+        <w:t>- To maintain a scalable PostgreSQL backend to aggregate feedback and serve real-time safety indices.</w:t>
+      </w:r>
+    </w:p>
+    <w:p>
+      <w:r>
+        <w:br w:type="page"/>
       </w:r>
     </w:p>
     <w:p>
       <w:pPr>
-        <w:pStyle w:val="ListBullet"/>
-        <w:spacing w:after="120" w:line="360" w:lineRule="auto"/>
-        <w:jc w:val="both"/>
-      </w:pPr>
-      <w:r>
-        <w:rPr>
-          <w:rFonts w:ascii="Times New Roman" w:hAnsi="Times New Roman"/>
-          <w:b w:val="0"/>
-          <w:sz w:val="24"/>
-        </w:rPr>
-        <w:t>- Mapping Engine: Leaflet.js with CartoDB Dark Matter tiles.</w:t>
-      </w:r>
-    </w:p>
-    <w:p>
-      <w:pPr>
-        <w:pStyle w:val="ListBullet"/>
-        <w:spacing w:after="120" w:line="360" w:lineRule="auto"/>
-        <w:jc w:val="both"/>
-      </w:pPr>
-      <w:r>
-        <w:rPr>
-          <w:rFonts w:ascii="Times New Roman" w:hAnsi="Times New Roman"/>
-          <w:b w:val="0"/>
-          <w:sz w:val="24"/>
-        </w:rPr>
-        <w:t>- Routing API: Open Source Routing Machine (OSRM) API.</w:t>
-      </w:r>
-    </w:p>
-    <w:p>
-      <w:pPr>
-        <w:pStyle w:val="ListBullet"/>
-        <w:spacing w:after="120" w:line="360" w:lineRule="auto"/>
-        <w:jc w:val="both"/>
-      </w:pPr>
-      <w:r>
-        <w:rPr>
-          <w:rFonts w:ascii="Times New Roman" w:hAnsi="Times New Roman"/>
-          <w:b w:val="0"/>
-          <w:sz w:val="24"/>
-        </w:rPr>
-        <w:t>- Geocoding API: OpenStreetMap Nominatim API.</w:t>
-      </w:r>
-    </w:p>
-    <w:p>
-      <w:pPr>
-        <w:pStyle w:val="ListBullet"/>
-        <w:spacing w:after="120" w:line="360" w:lineRule="auto"/>
-        <w:jc w:val="both"/>
-      </w:pPr>
-      <w:r>
-        <w:rPr>
-          <w:rFonts w:ascii="Times New Roman" w:hAnsi="Times New Roman"/>
-          <w:b w:val="0"/>
-          <w:sz w:val="24"/>
-        </w:rPr>
-        <w:t>- Backend Architecture: Supabase (PostgreSQL), providing secure REST APIs.</w:t>
-      </w:r>
-    </w:p>
-    <w:p>
-      <w:pPr>
-        <w:pStyle w:val="ListBullet"/>
-        <w:spacing w:after="120" w:line="360" w:lineRule="auto"/>
-        <w:jc w:val="both"/>
-      </w:pPr>
-      <w:r>
-        <w:rPr>
-          <w:rFonts w:ascii="Times New Roman" w:hAnsi="Times New Roman"/>
-          <w:b w:val="0"/>
-          <w:sz w:val="24"/>
-        </w:rPr>
-        <w:t>- Hosting/Deployment: Vercel (Edge Network).</w:t>
-      </w:r>
-    </w:p>
-    <w:p>
-      <w:pPr>
-        <w:spacing w:after="120" w:line="360" w:lineRule="auto"/>
-        <w:jc w:val="left"/>
+        <w:spacing w:before="480" w:after="240" w:line="360" w:lineRule="auto"/>
+        <w:jc w:val="center"/>
       </w:pPr>
       <w:r>
         <w:rPr>
@@ -365,7 +700,7 @@
           <w:b/>
           <w:sz w:val="32"/>
         </w:rPr>
-        <w:t>5. Proposed System Architecture</w:t>
+        <w:t>4. LITERATURE SURVEY</w:t>
       </w:r>
     </w:p>
     <w:p>
@@ -379,12 +714,12 @@
           <w:b w:val="0"/>
           <w:sz w:val="24"/>
         </w:rPr>
-        <w:t>The proposed system follows a decoupled Client-Server architecture. The client-side (Frontend) handles user inputs, map rendering via Leaflet, and API communication. When a user requests a route, the system geocodes the input using Nominatim, fetches the polyline geometry via OSRM, and overlays it onto the map. The backend (Supabase) acts as a centralized PostgreSQL repository storing historical safety reports, user sessions, and geographical heat markers.</w:t>
+        <w:t>A comprehensive review of existing systems was conducted to identify gaps in current solutions:</w:t>
       </w:r>
     </w:p>
     <w:p>
       <w:pPr>
-        <w:spacing w:after="120" w:line="360" w:lineRule="auto"/>
+        <w:spacing w:before="240" w:after="240" w:line="360" w:lineRule="auto"/>
         <w:jc w:val="left"/>
       </w:pPr>
       <w:r>
@@ -393,7 +728,7 @@
           <w:b/>
           <w:sz w:val="28"/>
         </w:rPr>
-        <w:t>5.1 Backend &amp; Database Design</w:t>
+        <w:t>4.1 Commercial Navigation Apps (Google Maps, Waze)</w:t>
       </w:r>
     </w:p>
     <w:p>
@@ -407,12 +742,25 @@
           <w:b w:val="0"/>
           <w:sz w:val="24"/>
         </w:rPr>
-        <w:t>The backend is powered by Supabase (PostgreSQL). The database is designed to handle geospatial data efficiently. Data gets stored and processed in the following manner:</w:t>
+        <w:t>While highly efficient, these apps focus on traffic density and distance. They do not incorporate environmental factors like street lighting or historical crime rates, often leading pedestrians into unlit or deserted areas at night.</w:t>
       </w:r>
     </w:p>
     <w:p>
       <w:pPr>
-        <w:pStyle w:val="ListBullet"/>
+        <w:spacing w:before="240" w:after="240" w:line="360" w:lineRule="auto"/>
+        <w:jc w:val="left"/>
+      </w:pPr>
+      <w:r>
+        <w:rPr>
+          <w:rFonts w:ascii="Times New Roman" w:hAnsi="Times New Roman"/>
+          <w:b/>
+          <w:sz w:val="28"/>
+        </w:rPr>
+        <w:t>4.2 Dedicated Safety Apps (Safetipin, Life360)</w:t>
+      </w:r>
+    </w:p>
+    <w:p>
+      <w:pPr>
         <w:spacing w:after="120" w:line="360" w:lineRule="auto"/>
         <w:jc w:val="both"/>
       </w:pPr>
@@ -422,12 +770,25 @@
           <w:b w:val="0"/>
           <w:sz w:val="24"/>
         </w:rPr>
-        <w:t>- Incidents/Feedback Storage: When a user submits a post-journey rating, a JSON payload containing the origin, destination, lighting score, crowd density score, and overall safety rating is POSTed to the Supabase endpoint.</w:t>
+        <w:t>Safetipin crowdsources safety data to audit city streets, providing a safety score. However, it functions primarily as an auditing tool rather than an active routing engine. Life360 focuses on location tracking and family sharing but lacks preemptive safe-routing capabilities.</w:t>
       </w:r>
     </w:p>
     <w:p>
       <w:pPr>
-        <w:pStyle w:val="ListBullet"/>
+        <w:spacing w:before="240" w:after="240" w:line="360" w:lineRule="auto"/>
+        <w:jc w:val="left"/>
+      </w:pPr>
+      <w:r>
+        <w:rPr>
+          <w:rFonts w:ascii="Times New Roman" w:hAnsi="Times New Roman"/>
+          <w:b/>
+          <w:sz w:val="28"/>
+        </w:rPr>
+        <w:t>4.3 The SafeRoute AI Advantage</w:t>
+      </w:r>
+    </w:p>
+    <w:p>
+      <w:pPr>
         <w:spacing w:after="120" w:line="360" w:lineRule="auto"/>
         <w:jc w:val="both"/>
       </w:pPr>
@@ -437,12 +798,44 @@
           <w:b w:val="0"/>
           <w:sz w:val="24"/>
         </w:rPr>
-        <w:t>- Data Aggregation: A PostgreSQL function aggregates feedback for overlapping coordinate regions, generating a normalized "Safety Index".</w:t>
+        <w:t>SafeRoute AI merges the best of both domains: it acts as a fully functional routing engine (via OSRM) while overlaying crowdsourced safety data (like Safetipin). By processing post-journey feedback natively, the app creates a self-sustaining ecosystem of safety intelligence.</w:t>
+      </w:r>
+    </w:p>
+    <w:p>
+      <w:r>
+        <w:br w:type="page"/>
       </w:r>
     </w:p>
     <w:p>
       <w:pPr>
-        <w:pStyle w:val="ListBullet"/>
+        <w:spacing w:before="480" w:after="240" w:line="360" w:lineRule="auto"/>
+        <w:jc w:val="center"/>
+      </w:pPr>
+      <w:r>
+        <w:rPr>
+          <w:rFonts w:ascii="Times New Roman" w:hAnsi="Times New Roman"/>
+          <w:b/>
+          <w:sz w:val="32"/>
+        </w:rPr>
+        <w:t>5. SYSTEM ANALYSIS &amp; FEASIBILITY</w:t>
+      </w:r>
+    </w:p>
+    <w:p>
+      <w:pPr>
+        <w:spacing w:before="240" w:after="240" w:line="360" w:lineRule="auto"/>
+        <w:jc w:val="left"/>
+      </w:pPr>
+      <w:r>
+        <w:rPr>
+          <w:rFonts w:ascii="Times New Roman" w:hAnsi="Times New Roman"/>
+          <w:b/>
+          <w:sz w:val="28"/>
+        </w:rPr>
+        <w:t>5.1 Technical Feasibility</w:t>
+      </w:r>
+    </w:p>
+    <w:p>
+      <w:pPr>
         <w:spacing w:after="120" w:line="360" w:lineRule="auto"/>
         <w:jc w:val="both"/>
       </w:pPr>
@@ -452,12 +845,12 @@
           <w:b w:val="0"/>
           <w:sz w:val="24"/>
         </w:rPr>
-        <w:t>- Heatmap Generation: The frontend fetches the aggregated Safety Index coordinates to generate the leaflet-heat layer, displaying red zones (low safety index) and green zones (high safety index).</w:t>
+        <w:t>The project is technically feasible as it utilizes well-documented, open-source technologies. HTML/JS handles the frontend, Leaflet handles rendering, and Supabase provides a robust PostgreSQL backend without the need for complex server management. APIs like Nominatim and OSRM are publicly available.</w:t>
       </w:r>
     </w:p>
     <w:p>
       <w:pPr>
-        <w:spacing w:after="120" w:line="360" w:lineRule="auto"/>
+        <w:spacing w:before="240" w:after="240" w:line="360" w:lineRule="auto"/>
         <w:jc w:val="left"/>
       </w:pPr>
       <w:r>
@@ -466,7 +859,110 @@
           <w:b/>
           <w:sz w:val="28"/>
         </w:rPr>
-        <w:t>5.2 Data Flow Diagram (DFD)</w:t>
+        <w:t>5.2 Economic Feasibility</w:t>
+      </w:r>
+    </w:p>
+    <w:p>
+      <w:pPr>
+        <w:spacing w:after="120" w:line="360" w:lineRule="auto"/>
+        <w:jc w:val="both"/>
+      </w:pPr>
+      <w:r>
+        <w:rPr>
+          <w:rFonts w:ascii="Times New Roman" w:hAnsi="Times New Roman"/>
+          <w:b w:val="0"/>
+          <w:sz w:val="24"/>
+        </w:rPr>
+        <w:t>The system relies entirely on free, open-source APIs (OSRM, OpenStreetMap) and free tiers of cloud providers (Supabase, Vercel). Therefore, the development and deployment costs are negligible, making it highly economically feasible.</w:t>
+      </w:r>
+    </w:p>
+    <w:p>
+      <w:pPr>
+        <w:spacing w:before="240" w:after="240" w:line="360" w:lineRule="auto"/>
+        <w:jc w:val="left"/>
+      </w:pPr>
+      <w:r>
+        <w:rPr>
+          <w:rFonts w:ascii="Times New Roman" w:hAnsi="Times New Roman"/>
+          <w:b/>
+          <w:sz w:val="28"/>
+        </w:rPr>
+        <w:t>5.3 Operational Feasibility</w:t>
+      </w:r>
+    </w:p>
+    <w:p>
+      <w:pPr>
+        <w:spacing w:after="120" w:line="360" w:lineRule="auto"/>
+        <w:jc w:val="both"/>
+      </w:pPr>
+      <w:r>
+        <w:rPr>
+          <w:rFonts w:ascii="Times New Roman" w:hAnsi="Times New Roman"/>
+          <w:b w:val="0"/>
+          <w:sz w:val="24"/>
+        </w:rPr>
+        <w:t>The user interface is designed to be highly intuitive, mimicking familiar mapping applications. The feedback loop is a simple, frictionless pop-up modal, ensuring high user adoption and engagement.</w:t>
+      </w:r>
+    </w:p>
+    <w:p>
+      <w:r>
+        <w:br w:type="page"/>
+      </w:r>
+    </w:p>
+    <w:p>
+      <w:pPr>
+        <w:spacing w:before="480" w:after="240" w:line="360" w:lineRule="auto"/>
+        <w:jc w:val="center"/>
+      </w:pPr>
+      <w:r>
+        <w:rPr>
+          <w:rFonts w:ascii="Times New Roman" w:hAnsi="Times New Roman"/>
+          <w:b/>
+          <w:sz w:val="32"/>
+        </w:rPr>
+        <w:t>6. SYSTEM DESIGN</w:t>
+      </w:r>
+    </w:p>
+    <w:p>
+      <w:pPr>
+        <w:spacing w:before="240" w:after="240" w:line="360" w:lineRule="auto"/>
+        <w:jc w:val="left"/>
+      </w:pPr>
+      <w:r>
+        <w:rPr>
+          <w:rFonts w:ascii="Times New Roman" w:hAnsi="Times New Roman"/>
+          <w:b/>
+          <w:sz w:val="28"/>
+        </w:rPr>
+        <w:t>6.1 Architecture Overview</w:t>
+      </w:r>
+    </w:p>
+    <w:p>
+      <w:pPr>
+        <w:spacing w:after="120" w:line="360" w:lineRule="auto"/>
+        <w:jc w:val="both"/>
+      </w:pPr>
+      <w:r>
+        <w:rPr>
+          <w:rFonts w:ascii="Times New Roman" w:hAnsi="Times New Roman"/>
+          <w:b w:val="0"/>
+          <w:sz w:val="24"/>
+        </w:rPr>
+        <w:t>The system utilizes a decoupled architecture. The frontend handles geocoding and rendering, while the backend processes feedback arrays into geographic heatmaps.</w:t>
+      </w:r>
+    </w:p>
+    <w:p>
+      <w:pPr>
+        <w:spacing w:before="240" w:after="240" w:line="360" w:lineRule="auto"/>
+        <w:jc w:val="left"/>
+      </w:pPr>
+      <w:r>
+        <w:rPr>
+          <w:rFonts w:ascii="Times New Roman" w:hAnsi="Times New Roman"/>
+          <w:b/>
+          <w:sz w:val="28"/>
+        </w:rPr>
+        <w:t>6.2 Data Flow Diagram (DFD)</w:t>
       </w:r>
     </w:p>
     <w:p>
@@ -476,7 +972,7 @@
       <w:r>
         <w:drawing>
           <wp:inline xmlns:a="http://schemas.openxmlformats.org/drawingml/2006/main" xmlns:pic="http://schemas.openxmlformats.org/drawingml/2006/picture">
-            <wp:extent cx="5486400" cy="1750857"/>
+            <wp:extent cx="4572000" cy="2372986"/>
             <wp:docPr id="1" name="Picture 1"/>
             <wp:cNvGraphicFramePr>
               <a:graphicFrameLocks noChangeAspect="1"/>
@@ -497,7 +993,7 @@
                   <pic:spPr>
                     <a:xfrm>
                       <a:off x="0" y="0"/>
-                      <a:ext cx="5486400" cy="1750857"/>
+                      <a:ext cx="4572000" cy="2372986"/>
                     </a:xfrm>
                     <a:prstGeom prst="rect"/>
                   </pic:spPr>
@@ -517,19 +1013,14 @@
         <w:rPr>
           <w:rFonts w:ascii="Times New Roman" w:hAnsi="Times New Roman"/>
           <w:b/>
-          <w:sz w:val="22"/>
+          <w:sz w:val="24"/>
         </w:rPr>
-        <w:t>Figure 1: Level 0 DFD (Context Diagram)</w:t>
-      </w:r>
-    </w:p>
-    <w:p>
-      <w:r>
-        <w:br w:type="page"/>
+        <w:t>Figure 1: Data Flow Diagram</w:t>
       </w:r>
     </w:p>
     <w:p>
       <w:pPr>
-        <w:spacing w:after="120" w:line="360" w:lineRule="auto"/>
+        <w:spacing w:before="240" w:after="240" w:line="360" w:lineRule="auto"/>
         <w:jc w:val="left"/>
       </w:pPr>
       <w:r>
@@ -538,21 +1029,7 @@
           <w:b/>
           <w:sz w:val="28"/>
         </w:rPr>
-        <w:t>5.3 Entity Relationship (ER) Diagram</w:t>
-      </w:r>
-    </w:p>
-    <w:p>
-      <w:pPr>
-        <w:spacing w:after="120" w:line="360" w:lineRule="auto"/>
-        <w:jc w:val="both"/>
-      </w:pPr>
-      <w:r>
-        <w:rPr>
-          <w:rFonts w:ascii="Times New Roman" w:hAnsi="Times New Roman"/>
-          <w:b w:val="0"/>
-          <w:sz w:val="24"/>
-        </w:rPr>
-        <w:t>The core entities managed by the Supabase PostgreSQL database include Users, Routes, and Feedback instances. The relationships are designed in Third Normal Form (3NF).</w:t>
+        <w:t>6.3 Entity Relationship (ER) Diagram</w:t>
       </w:r>
     </w:p>
     <w:p>
@@ -562,7 +1039,7 @@
       <w:r>
         <w:drawing>
           <wp:inline xmlns:a="http://schemas.openxmlformats.org/drawingml/2006/main" xmlns:pic="http://schemas.openxmlformats.org/drawingml/2006/picture">
-            <wp:extent cx="4572000" cy="4884057"/>
+            <wp:extent cx="3657600" cy="3766686"/>
             <wp:docPr id="2" name="Picture 2"/>
             <wp:cNvGraphicFramePr>
               <a:graphicFrameLocks noChangeAspect="1"/>
@@ -583,7 +1060,7 @@
                   <pic:spPr>
                     <a:xfrm>
                       <a:off x="0" y="0"/>
-                      <a:ext cx="4572000" cy="4884057"/>
+                      <a:ext cx="3657600" cy="3766686"/>
                     </a:xfrm>
                     <a:prstGeom prst="rect"/>
                   </pic:spPr>
@@ -603,15 +1080,87 @@
         <w:rPr>
           <w:rFonts w:ascii="Times New Roman" w:hAnsi="Times New Roman"/>
           <w:b/>
-          <w:sz w:val="22"/>
+          <w:sz w:val="24"/>
         </w:rPr>
-        <w:t>Figure 2: Entity Relationship Diagram</w:t>
+        <w:t>Figure 2: ER Diagram</w:t>
+      </w:r>
+    </w:p>
+    <w:p>
+      <w:r>
+        <w:br w:type="page"/>
+      </w:r>
+    </w:p>
+    <w:p>
+      <w:pPr>
+        <w:spacing w:before="240" w:after="240" w:line="360" w:lineRule="auto"/>
+        <w:jc w:val="left"/>
+      </w:pPr>
+      <w:r>
+        <w:rPr>
+          <w:rFonts w:ascii="Times New Roman" w:hAnsi="Times New Roman"/>
+          <w:b/>
+          <w:sz w:val="28"/>
+        </w:rPr>
+        <w:t>6.4 System Interaction Map</w:t>
+      </w:r>
+    </w:p>
+    <w:p>
+      <w:pPr>
+        <w:jc w:val="center"/>
+      </w:pPr>
+      <w:r>
+        <w:drawing>
+          <wp:inline xmlns:a="http://schemas.openxmlformats.org/drawingml/2006/main" xmlns:pic="http://schemas.openxmlformats.org/drawingml/2006/picture">
+            <wp:extent cx="3657600" cy="2730440"/>
+            <wp:docPr id="3" name="Picture 3"/>
+            <wp:cNvGraphicFramePr>
+              <a:graphicFrameLocks noChangeAspect="1"/>
+            </wp:cNvGraphicFramePr>
+            <a:graphic>
+              <a:graphicData uri="http://schemas.openxmlformats.org/drawingml/2006/picture">
+                <pic:pic>
+                  <pic:nvPicPr>
+                    <pic:cNvPr id="0" name="uc.png"/>
+                    <pic:cNvPicPr/>
+                  </pic:nvPicPr>
+                  <pic:blipFill>
+                    <a:blip r:embed="rId11"/>
+                    <a:stretch>
+                      <a:fillRect/>
+                    </a:stretch>
+                  </pic:blipFill>
+                  <pic:spPr>
+                    <a:xfrm>
+                      <a:off x="0" y="0"/>
+                      <a:ext cx="3657600" cy="2730440"/>
+                    </a:xfrm>
+                    <a:prstGeom prst="rect"/>
+                  </pic:spPr>
+                </pic:pic>
+              </a:graphicData>
+            </a:graphic>
+          </wp:inline>
+        </w:drawing>
       </w:r>
     </w:p>
     <w:p>
       <w:pPr>
         <w:spacing w:after="120" w:line="360" w:lineRule="auto"/>
-        <w:jc w:val="left"/>
+        <w:jc w:val="center"/>
+      </w:pPr>
+      <w:r>
+        <w:rPr>
+          <w:rFonts w:ascii="Times New Roman" w:hAnsi="Times New Roman"/>
+          <w:b/>
+          <w:sz w:val="24"/>
+        </w:rPr>
+        <w:t>Figure 3: System Component Interaction</w:t>
+      </w:r>
+    </w:p>
+    <w:p>
+      <w:pPr>
+        <w:spacing w:before="480" w:after="240" w:line="360" w:lineRule="auto"/>
+        <w:jc w:val="center"/>
       </w:pPr>
       <w:r>
         <w:rPr>
@@ -619,7 +1168,21 @@
           <w:b/>
           <w:sz w:val="32"/>
         </w:rPr>
-        <w:t>6. Database Schema (Tables)</w:t>
+        <w:t>7. DATABASE SCHEMA</w:t>
+      </w:r>
+    </w:p>
+    <w:p>
+      <w:pPr>
+        <w:spacing w:after="120" w:line="360" w:lineRule="auto"/>
+        <w:jc w:val="both"/>
+      </w:pPr>
+      <w:r>
+        <w:rPr>
+          <w:rFonts w:ascii="Times New Roman" w:hAnsi="Times New Roman"/>
+          <w:b w:val="0"/>
+          <w:sz w:val="24"/>
+        </w:rPr>
+        <w:t>The Supabase relational database is normalized to 3NF. It contains three primary tables:</w:t>
       </w:r>
     </w:p>
     <w:tbl>
@@ -749,7 +1312,7 @@
                 <w:rFonts w:ascii="Times New Roman" w:hAnsi="Times New Roman"/>
                 <w:sz w:val="22"/>
               </w:rPr>
-              <w:t>Stores authenticated user information and preferences.</w:t>
+              <w:t>Stores user profiles.</w:t>
             </w:r>
           </w:p>
         </w:tc>
@@ -807,7 +1370,7 @@
                 <w:rFonts w:ascii="Times New Roman" w:hAnsi="Times New Roman"/>
                 <w:sz w:val="22"/>
               </w:rPr>
-              <w:t>Stores unique routes queried by users including geo-spatial polyline data.</w:t>
+              <w:t>Stores unique routes queried.</w:t>
             </w:r>
           </w:p>
         </w:tc>
@@ -865,30 +1428,21 @@
                 <w:rFonts w:ascii="Times New Roman" w:hAnsi="Times New Roman"/>
                 <w:sz w:val="22"/>
               </w:rPr>
-              <w:t>Stores crowdsourced ratings for lighting, crowd density, and safety.</w:t>
+              <w:t>Stores crowdsourced parameter ratings.</w:t>
             </w:r>
           </w:p>
         </w:tc>
       </w:tr>
     </w:tbl>
     <w:p>
-      <w:pPr>
-        <w:spacing w:after="120" w:line="360" w:lineRule="auto"/>
-        <w:jc w:val="center"/>
-      </w:pPr>
       <w:r>
-        <w:rPr>
-          <w:rFonts w:ascii="Times New Roman" w:hAnsi="Times New Roman"/>
-          <w:b/>
-          <w:sz w:val="22"/>
-        </w:rPr>
-        <w:t>Table 1: Supabase Relational Schema Overview</w:t>
+        <w:br w:type="page"/>
       </w:r>
     </w:p>
     <w:p>
       <w:pPr>
-        <w:spacing w:after="120" w:line="360" w:lineRule="auto"/>
-        <w:jc w:val="left"/>
+        <w:spacing w:before="480" w:after="240" w:line="360" w:lineRule="auto"/>
+        <w:jc w:val="center"/>
       </w:pPr>
       <w:r>
         <w:rPr>
@@ -896,7 +1450,166 @@
           <w:b/>
           <w:sz w:val="32"/>
         </w:rPr>
-        <w:t>7. Future Enhancements</w:t>
+        <w:t>8. IMPLEMENTATION METHODOLOGY</w:t>
+      </w:r>
+    </w:p>
+    <w:p>
+      <w:pPr>
+        <w:spacing w:after="120" w:line="360" w:lineRule="auto"/>
+        <w:jc w:val="both"/>
+      </w:pPr>
+      <w:r>
+        <w:rPr>
+          <w:rFonts w:ascii="Times New Roman" w:hAnsi="Times New Roman"/>
+          <w:b w:val="0"/>
+          <w:sz w:val="24"/>
+        </w:rPr>
+        <w:t>The implementation follows an agile methodology, divided into key modules:</w:t>
+      </w:r>
+    </w:p>
+    <w:p>
+      <w:pPr>
+        <w:spacing w:before="240" w:after="240" w:line="360" w:lineRule="auto"/>
+        <w:jc w:val="left"/>
+      </w:pPr>
+      <w:r>
+        <w:rPr>
+          <w:rFonts w:ascii="Times New Roman" w:hAnsi="Times New Roman"/>
+          <w:b/>
+          <w:sz w:val="28"/>
+        </w:rPr>
+        <w:t>8.1 Heatmap Implementation</w:t>
+      </w:r>
+    </w:p>
+    <w:p>
+      <w:pPr>
+        <w:spacing w:after="120" w:line="360" w:lineRule="auto"/>
+        <w:jc w:val="both"/>
+      </w:pPr>
+      <w:r>
+        <w:rPr>
+          <w:rFonts w:ascii="Times New Roman" w:hAnsi="Times New Roman"/>
+          <w:b w:val="0"/>
+          <w:sz w:val="24"/>
+        </w:rPr>
+        <w:t>The application uses Leaflet.js combined with the Leaflet.heat plugin. Heat data points are dynamically clustered. Red zones denote a high frequency of negative feedback (e.g., poor lighting), while green zones indicate safe areas.</w:t>
+      </w:r>
+    </w:p>
+    <w:p>
+      <w:pPr>
+        <w:spacing w:before="240" w:after="240" w:line="360" w:lineRule="auto"/>
+        <w:jc w:val="left"/>
+      </w:pPr>
+      <w:r>
+        <w:rPr>
+          <w:rFonts w:ascii="Times New Roman" w:hAnsi="Times New Roman"/>
+          <w:b/>
+          <w:sz w:val="28"/>
+        </w:rPr>
+        <w:t>8.2 Dynamic Routing Engine</w:t>
+      </w:r>
+    </w:p>
+    <w:p>
+      <w:pPr>
+        <w:spacing w:after="120" w:line="360" w:lineRule="auto"/>
+        <w:jc w:val="both"/>
+      </w:pPr>
+      <w:r>
+        <w:rPr>
+          <w:rFonts w:ascii="Times New Roman" w:hAnsi="Times New Roman"/>
+          <w:b w:val="0"/>
+          <w:sz w:val="24"/>
+        </w:rPr>
+        <w:t>When a user inputs an origin and destination, the text strings are sent via REST to the Nominatim API to receive Latitude and Longitude. These coordinates are then passed to the OSRM Driving API, which returns a GeoJSON polyline representing the physical road network.</w:t>
+      </w:r>
+    </w:p>
+    <w:p>
+      <w:pPr>
+        <w:spacing w:before="240" w:after="240" w:line="360" w:lineRule="auto"/>
+        <w:jc w:val="left"/>
+      </w:pPr>
+      <w:r>
+        <w:rPr>
+          <w:rFonts w:ascii="Times New Roman" w:hAnsi="Times New Roman"/>
+          <w:b/>
+          <w:sz w:val="28"/>
+        </w:rPr>
+        <w:t>8.3 Feedback Simulation Module</w:t>
+      </w:r>
+    </w:p>
+    <w:p>
+      <w:pPr>
+        <w:spacing w:after="120" w:line="360" w:lineRule="auto"/>
+        <w:jc w:val="both"/>
+      </w:pPr>
+      <w:r>
+        <w:rPr>
+          <w:rFonts w:ascii="Times New Roman" w:hAnsi="Times New Roman"/>
+          <w:b w:val="0"/>
+          <w:sz w:val="24"/>
+        </w:rPr>
+        <w:t>Upon journey completion, a modal interface collects multi-parametric data (Crowd Density, Lighting, Overall Safety). This data updates the global heatmap state in real-time, influencing future route safety predictions.</w:t>
+      </w:r>
+    </w:p>
+    <w:p>
+      <w:r>
+        <w:br w:type="page"/>
+      </w:r>
+    </w:p>
+    <w:p>
+      <w:pPr>
+        <w:spacing w:before="480" w:after="240" w:line="360" w:lineRule="auto"/>
+        <w:jc w:val="center"/>
+      </w:pPr>
+      <w:r>
+        <w:rPr>
+          <w:rFonts w:ascii="Times New Roman" w:hAnsi="Times New Roman"/>
+          <w:b/>
+          <w:sz w:val="32"/>
+        </w:rPr>
+        <w:t>9. CONCLUSION &amp; FUTURE SCOPE</w:t>
+      </w:r>
+    </w:p>
+    <w:p>
+      <w:pPr>
+        <w:spacing w:before="240" w:after="240" w:line="360" w:lineRule="auto"/>
+        <w:jc w:val="left"/>
+      </w:pPr>
+      <w:r>
+        <w:rPr>
+          <w:rFonts w:ascii="Times New Roman" w:hAnsi="Times New Roman"/>
+          <w:b/>
+          <w:sz w:val="28"/>
+        </w:rPr>
+        <w:t>9.1 Conclusion</w:t>
+      </w:r>
+    </w:p>
+    <w:p>
+      <w:pPr>
+        <w:spacing w:after="120" w:line="360" w:lineRule="auto"/>
+        <w:jc w:val="both"/>
+      </w:pPr>
+      <w:r>
+        <w:rPr>
+          <w:rFonts w:ascii="Times New Roman" w:hAnsi="Times New Roman"/>
+          <w:b w:val="0"/>
+          <w:sz w:val="24"/>
+        </w:rPr>
+        <w:t>SafeRoute AI successfully demonstrates the feasibility of combining open-source routing algorithms with crowdsourced intelligence. By prioritizing human safety over mere distance efficiency and establishing a continuous feedback loop, the application creates a scalable, evolving ecosystem that actively works to make urban navigation safer for women.</w:t>
+      </w:r>
+    </w:p>
+    <w:p>
+      <w:pPr>
+        <w:spacing w:before="240" w:after="240" w:line="360" w:lineRule="auto"/>
+        <w:jc w:val="left"/>
+      </w:pPr>
+      <w:r>
+        <w:rPr>
+          <w:rFonts w:ascii="Times New Roman" w:hAnsi="Times New Roman"/>
+          <w:b/>
+          <w:sz w:val="28"/>
+        </w:rPr>
+        <w:t>9.2 Future Scope</w:t>
       </w:r>
     </w:p>
     <w:p>
@@ -911,7 +1624,7 @@
           <w:b w:val="0"/>
           <w:sz w:val="24"/>
         </w:rPr>
-        <w:t>- SOS Integration: Adding a panic button that instantly broadcasts live location to emergency contacts and local authorities.</w:t>
+        <w:t>- SOS Integration: Panic button for emergency broadcasts.</w:t>
       </w:r>
     </w:p>
     <w:p>
@@ -926,7 +1639,7 @@
           <w:b w:val="0"/>
           <w:sz w:val="24"/>
         </w:rPr>
-        <w:t>- Machine Learning: Training an LSTM model on the PostgreSQL data to predict route safety dynamically based on the time of day.</w:t>
+        <w:t>- Machine Learning: LSTM models to predict safety dynamically based on time of day.</w:t>
       </w:r>
     </w:p>
     <w:p>
@@ -941,13 +1654,13 @@
           <w:b w:val="0"/>
           <w:sz w:val="24"/>
         </w:rPr>
-        <w:t>- Voice Navigation: Implementing turn-by-turn voice directions so users do not need to hold their phones out in high-risk areas.</w:t>
+        <w:t>- Mobile Application: React Native port for seamless mobile experience and background GPS tracking.</w:t>
       </w:r>
     </w:p>
     <w:p>
       <w:pPr>
-        <w:spacing w:after="120" w:line="360" w:lineRule="auto"/>
-        <w:jc w:val="left"/>
+        <w:spacing w:before="480" w:after="240" w:line="360" w:lineRule="auto"/>
+        <w:jc w:val="center"/>
       </w:pPr>
       <w:r>
         <w:rPr>
@@ -955,7 +1668,7 @@
           <w:b/>
           <w:sz w:val="32"/>
         </w:rPr>
-        <w:t>8. Conclusion</w:t>
+        <w:t>10. REFERENCES</w:t>
       </w:r>
     </w:p>
     <w:p>
@@ -969,7 +1682,49 @@
           <w:b w:val="0"/>
           <w:sz w:val="24"/>
         </w:rPr>
-        <w:t>SafeRoute AI successfully demonstrates the feasibility of combining open-source routing APIs with crowdsourced data to prioritize pedestrian safety over mere distance efficiency. By establishing a continuous feedback loop and utilizing a robust PostgreSQL backend via Supabase, the application creates a scalable, evolving ecosystem that actively works to make urban navigation safer for women.</w:t>
+        <w:t>- Leaflet.js Documentation: https://leafletjs.com/</w:t>
+      </w:r>
+    </w:p>
+    <w:p>
+      <w:pPr>
+        <w:spacing w:after="120" w:line="360" w:lineRule="auto"/>
+        <w:jc w:val="both"/>
+      </w:pPr>
+      <w:r>
+        <w:rPr>
+          <w:rFonts w:ascii="Times New Roman" w:hAnsi="Times New Roman"/>
+          <w:b w:val="0"/>
+          <w:sz w:val="24"/>
+        </w:rPr>
+        <w:t>- OSRM API Reference: http://project-osrm.org/docs/v5.24.0/api/</w:t>
+      </w:r>
+    </w:p>
+    <w:p>
+      <w:pPr>
+        <w:spacing w:after="120" w:line="360" w:lineRule="auto"/>
+        <w:jc w:val="both"/>
+      </w:pPr>
+      <w:r>
+        <w:rPr>
+          <w:rFonts w:ascii="Times New Roman" w:hAnsi="Times New Roman"/>
+          <w:b w:val="0"/>
+          <w:sz w:val="24"/>
+        </w:rPr>
+        <w:t>- Nominatim Geocoding API: https://nominatim.org/</w:t>
+      </w:r>
+    </w:p>
+    <w:p>
+      <w:pPr>
+        <w:spacing w:after="120" w:line="360" w:lineRule="auto"/>
+        <w:jc w:val="both"/>
+      </w:pPr>
+      <w:r>
+        <w:rPr>
+          <w:rFonts w:ascii="Times New Roman" w:hAnsi="Times New Roman"/>
+          <w:b w:val="0"/>
+          <w:sz w:val="24"/>
+        </w:rPr>
+        <w:t>- Supabase Architecture: https://supabase.com/docs</w:t>
       </w:r>
     </w:p>
     <w:sectPr>

</xml_diff>